<commit_message>
docs: publish annotated training templates
</commit_message>
<xml_diff>
--- a/documents/templates/air-waybill-training.docx
+++ b/documents/templates/air-waybill-training.docx
@@ -1,6 +1,6 @@
 
 <file path=word/document.xml><?xml version="1.0" encoding="utf-8"?>
-<w:document xmlns:wpc="http://schemas.microsoft.com/office/word/2010/wordprocessingCanvas" xmlns:cx="http://schemas.microsoft.com/office/drawing/2014/chartex" xmlns:cx1="http://schemas.microsoft.com/office/drawing/2015/9/8/chartex" xmlns:cx2="http://schemas.microsoft.com/office/drawing/2015/10/21/chartex" xmlns:cx3="http://schemas.microsoft.com/office/drawing/2016/5/9/chartex" xmlns:cx4="http://schemas.microsoft.com/office/drawing/2016/5/10/chartex" xmlns:cx5="http://schemas.microsoft.com/office/drawing/2016/5/11/chartex" xmlns:cx6="http://schemas.microsoft.com/office/drawing/2016/5/12/chartex" xmlns:cx7="http://schemas.microsoft.com/office/drawing/2016/5/13/chartex" xmlns:cx8="http://schemas.microsoft.com/office/drawing/2016/5/14/chartex" xmlns:mc="http://schemas.openxmlformats.org/markup-compatibility/2006" xmlns:aink="http://schemas.microsoft.com/office/drawing/2016/ink" xmlns:am3d="http://schemas.microsoft.com/office/drawing/2017/model3d" xmlns:o="urn:schemas-microsoft-com:office:office" xmlns:oel="http://schemas.microsoft.com/office/2019/extlst" xmlns:r="http://schemas.openxmlformats.org/officeDocument/2006/relationships" xmlns:m="http://schemas.openxmlformats.org/officeDocument/2006/math" xmlns:v="urn:schemas-microsoft-com:vml" xmlns:wp14="http://schemas.microsoft.com/office/word/2010/wordprocessingDrawing" xmlns:wp="http://schemas.openxmlformats.org/drawingml/2006/wordprocessingDrawing" xmlns:w10="urn:schemas-microsoft-com:office:word" xmlns:w="http://schemas.openxmlformats.org/wordprocessingml/2006/main" xmlns:w14="http://schemas.microsoft.com/office/word/2010/wordml" xmlns:w15="http://schemas.microsoft.com/office/word/2012/wordml" xmlns:w16cei="http://schemas.microsoft.com/office/word/2026/wordml/cei" xmlns:w16cex="http://schemas.microsoft.com/office/word/2018/wordml/cex" xmlns:w16cid="http://schemas.microsoft.com/office/word/2016/wordml/cid" xmlns:w16="http://schemas.microsoft.com/office/word/2018/wordml" xmlns:w16du="http://schemas.microsoft.com/office/word/2023/wordml/word16du" xmlns:w16sdtdh="http://schemas.microsoft.com/office/word/2020/wordml/sdtdatahash" xmlns:w16sdtfl="http://schemas.microsoft.com/office/word/2024/wordml/sdtformatlock" xmlns:w16se="http://schemas.microsoft.com/office/word/2015/wordml/symex" xmlns:wpg="http://schemas.microsoft.com/office/word/2010/wordprocessingGroup" xmlns:wpi="http://schemas.microsoft.com/office/word/2010/wordprocessingInk" xmlns:wne="http://schemas.microsoft.com/office/word/2006/wordml" xmlns:wps="http://schemas.microsoft.com/office/word/2010/wordprocessingShape" mc:Ignorable="w14 w15 w16se w16cid w16 w16cex w16sdtdh w16sdtfl w16du wp14">
+<w:document xmlns:wpc="http://schemas.microsoft.com/office/word/2010/wordprocessingCanvas" xmlns:cx="http://schemas.microsoft.com/office/drawing/2014/chartex" xmlns:cx1="http://schemas.microsoft.com/office/drawing/2015/9/8/chartex" xmlns:cx2="http://schemas.microsoft.com/office/drawing/2015/10/21/chartex" xmlns:cx3="http://schemas.microsoft.com/office/drawing/2016/5/9/chartex" xmlns:cx4="http://schemas.microsoft.com/office/drawing/2016/5/10/chartex" xmlns:cx5="http://schemas.microsoft.com/office/drawing/2016/5/11/chartex" xmlns:cx6="http://schemas.microsoft.com/office/drawing/2016/5/12/chartex" xmlns:cx7="http://schemas.microsoft.com/office/drawing/2016/5/13/chartex" xmlns:cx8="http://schemas.microsoft.com/office/drawing/2016/5/14/chartex" xmlns:mc="http://schemas.openxmlformats.org/markup-compatibility/2006" xmlns:aink="http://schemas.microsoft.com/office/drawing/2016/ink" xmlns:am3d="http://schemas.microsoft.com/office/drawing/2017/model3d" xmlns:o="urn:schemas-microsoft-com:office:office" xmlns:oel="http://schemas.microsoft.com/office/2019/extlst" xmlns:r="http://schemas.openxmlformats.org/officeDocument/2006/relationships" xmlns:m="http://schemas.openxmlformats.org/officeDocument/2006/math" xmlns:v="urn:schemas-microsoft-com:vml" xmlns:wp14="http://schemas.microsoft.com/office/word/2010/wordprocessingDrawing" xmlns:wp="http://schemas.openxmlformats.org/drawingml/2006/wordprocessingDrawing" xmlns:w10="urn:schemas-microsoft-com:office:word" xmlns:w="http://schemas.openxmlformats.org/wordprocessingml/2006/main" xmlns:w14="http://schemas.microsoft.com/office/word/2010/wordml" xmlns:w15="http://schemas.microsoft.com/office/word/2012/wordml" xmlns:w16cex="http://schemas.microsoft.com/office/word/2018/wordml/cex" xmlns:w16cid="http://schemas.microsoft.com/office/word/2016/wordml/cid" xmlns:w16="http://schemas.microsoft.com/office/word/2018/wordml" xmlns:w16du="http://schemas.microsoft.com/office/word/2023/wordml/word16du" xmlns:w16sdtdh="http://schemas.microsoft.com/office/word/2020/wordml/sdtdatahash" xmlns:w16sdtfl="http://schemas.microsoft.com/office/word/2024/wordml/sdtformatlock" xmlns:w16se="http://schemas.microsoft.com/office/word/2015/wordml/symex" xmlns:wpg="http://schemas.microsoft.com/office/word/2010/wordprocessingGroup" xmlns:wpi="http://schemas.microsoft.com/office/word/2010/wordprocessingInk" xmlns:wne="http://schemas.microsoft.com/office/word/2006/wordml" xmlns:wps="http://schemas.microsoft.com/office/word/2010/wordprocessingShape" mc:Ignorable="w14 w15 w16se w16cid w16 w16cex w16sdtdh w16sdtfl w16du wp14">
   <w:body>
     <w:p>
       <w:pPr>
@@ -72,6 +72,36 @@
               </w:rPr>
               <w:t>Shipper's Name and Address                         Shipper's Account Number</w:t>
             </w:r>
+            <w:r>
+              <w:rPr>
+                <w:rFonts w:eastAsia="微軟正黑體"/>
+                <w:color w:val="C00000"/>
+                <w:sz w:val="12"/>
+              </w:rPr>
+              <w:br/>
+            </w:r>
+            <w:proofErr w:type="spellStart"/>
+            <w:r>
+              <w:rPr>
+                <w:rFonts w:eastAsia="微軟正黑體"/>
+                <w:color w:val="C00000"/>
+                <w:sz w:val="24"/>
+                <w:szCs w:val="24"/>
+              </w:rPr>
+              <w:t>託運人名稱／地址；客戶帳號</w:t>
+            </w:r>
+            <w:proofErr w:type="spellEnd"/>
+            <w:r>
+              <w:rPr>
+                <w:rFonts w:eastAsia="微軟正黑體"/>
+                <w:i/>
+                <w:color w:val="C00000"/>
+                <w:sz w:val="24"/>
+                <w:szCs w:val="24"/>
+              </w:rPr>
+              <w:br/>
+              <w:t>E.g. SAMPLE EXPORTER / SAMPLE-ACCT-01</w:t>
+            </w:r>
           </w:p>
           <w:p>
             <w:r>
@@ -171,6 +201,34 @@
               </w:rPr>
               <w:t>Consignee's Name and Address                      Consignee's Account Number</w:t>
             </w:r>
+            <w:r>
+              <w:rPr>
+                <w:rFonts w:eastAsia="微軟正黑體"/>
+                <w:color w:val="C00000"/>
+                <w:sz w:val="12"/>
+              </w:rPr>
+              <w:br/>
+            </w:r>
+            <w:proofErr w:type="spellStart"/>
+            <w:r>
+              <w:rPr>
+                <w:rFonts w:eastAsia="微軟正黑體"/>
+                <w:color w:val="C00000"/>
+                <w:sz w:val="12"/>
+              </w:rPr>
+              <w:t>收貨人名稱／地址；客戶帳號</w:t>
+            </w:r>
+            <w:proofErr w:type="spellEnd"/>
+            <w:r>
+              <w:rPr>
+                <w:rFonts w:eastAsia="微軟正黑體"/>
+                <w:i/>
+                <w:color w:val="C00000"/>
+                <w:sz w:val="11"/>
+              </w:rPr>
+              <w:br/>
+              <w:t>E.g. SAMPLE IMPORTER / SAMPLE-ACCT-02</w:t>
+            </w:r>
           </w:p>
           <w:p>
             <w:r>
@@ -211,7 +269,35 @@
               <w:rPr>
                 <w:sz w:val="10"/>
               </w:rPr>
-              <w:t>Copies 1, 2 and 3 of this Air Waybill are originals and have the same validity.</w:t>
+              <w:t xml:space="preserve">Copies 1, 2 and 3 of this Air Waybill are </w:t>
+            </w:r>
+            <w:proofErr w:type="gramStart"/>
+            <w:r>
+              <w:rPr>
+                <w:sz w:val="10"/>
+              </w:rPr>
+              <w:t>originals</w:t>
+            </w:r>
+            <w:proofErr w:type="gramEnd"/>
+            <w:r>
+              <w:rPr>
+                <w:sz w:val="10"/>
+              </w:rPr>
+              <w:t xml:space="preserve"> and </w:t>
+            </w:r>
+            <w:proofErr w:type="gramStart"/>
+            <w:r>
+              <w:rPr>
+                <w:sz w:val="10"/>
+              </w:rPr>
+              <w:t>have</w:t>
+            </w:r>
+            <w:proofErr w:type="gramEnd"/>
+            <w:r>
+              <w:rPr>
+                <w:sz w:val="10"/>
+              </w:rPr>
+              <w:t xml:space="preserve"> the same validity.</w:t>
             </w:r>
           </w:p>
           <w:p>
@@ -330,6 +416,34 @@
               </w:rPr>
               <w:t>Issuing Carrier's Agent Name and City</w:t>
             </w:r>
+            <w:r>
+              <w:rPr>
+                <w:rFonts w:eastAsia="微軟正黑體"/>
+                <w:color w:val="C00000"/>
+                <w:sz w:val="12"/>
+              </w:rPr>
+              <w:br/>
+            </w:r>
+            <w:proofErr w:type="spellStart"/>
+            <w:r>
+              <w:rPr>
+                <w:rFonts w:eastAsia="微軟正黑體"/>
+                <w:color w:val="C00000"/>
+                <w:sz w:val="12"/>
+              </w:rPr>
+              <w:t>簽發代理名稱／城市</w:t>
+            </w:r>
+            <w:proofErr w:type="spellEnd"/>
+            <w:r>
+              <w:rPr>
+                <w:rFonts w:eastAsia="微軟正黑體"/>
+                <w:i/>
+                <w:color w:val="C00000"/>
+                <w:sz w:val="11"/>
+              </w:rPr>
+              <w:br/>
+              <w:t>E.g. SAMPLE FORWARDER / TAIPEI</w:t>
+            </w:r>
           </w:p>
           <w:p>
             <w:r>
@@ -380,6 +494,34 @@
               </w:rPr>
               <w:br/>
               <w:t>NOTIFY PARTY:</w:t>
+            </w:r>
+            <w:r>
+              <w:rPr>
+                <w:rFonts w:eastAsia="微軟正黑體"/>
+                <w:color w:val="C00000"/>
+                <w:sz w:val="11"/>
+              </w:rPr>
+              <w:br/>
+            </w:r>
+            <w:proofErr w:type="spellStart"/>
+            <w:r>
+              <w:rPr>
+                <w:rFonts w:eastAsia="微軟正黑體"/>
+                <w:color w:val="C00000"/>
+                <w:sz w:val="11"/>
+              </w:rPr>
+              <w:t>特殊帳務／付款資訊；到貨通知方</w:t>
+            </w:r>
+            <w:proofErr w:type="spellEnd"/>
+            <w:r>
+              <w:rPr>
+                <w:rFonts w:eastAsia="微軟正黑體"/>
+                <w:i/>
+                <w:color w:val="C00000"/>
+                <w:sz w:val="11"/>
+              </w:rPr>
+              <w:br/>
+              <w:t>E.g. PREPAID / SAMPLE NOTIFY PARTY</w:t>
             </w:r>
           </w:p>
           <w:p>
@@ -443,6 +585,66 @@
                     </w:rPr>
                     <w:t>Agent's IATA Code</w:t>
                   </w:r>
+                  <w:r>
+                    <w:rPr>
+                      <w:rFonts w:eastAsia="微軟正黑體"/>
+                      <w:i/>
+                      <w:color w:val="C00000"/>
+                      <w:sz w:val="10"/>
+                    </w:rPr>
+                    <w:br/>
+                  </w:r>
+                  <w:proofErr w:type="spellStart"/>
+                  <w:r>
+                    <w:rPr>
+                      <w:rFonts w:eastAsia="微軟正黑體"/>
+                      <w:i/>
+                      <w:color w:val="C00000"/>
+                      <w:sz w:val="10"/>
+                    </w:rPr>
+                    <w:t>代理</w:t>
+                  </w:r>
+                  <w:proofErr w:type="spellEnd"/>
+                  <w:r>
+                    <w:rPr>
+                      <w:rFonts w:eastAsia="微軟正黑體"/>
+                      <w:i/>
+                      <w:color w:val="C00000"/>
+                      <w:sz w:val="10"/>
+                    </w:rPr>
+                    <w:t xml:space="preserve"> IATA </w:t>
+                  </w:r>
+                  <w:proofErr w:type="spellStart"/>
+                  <w:proofErr w:type="gramStart"/>
+                  <w:r>
+                    <w:rPr>
+                      <w:rFonts w:eastAsia="微軟正黑體"/>
+                      <w:i/>
+                      <w:color w:val="C00000"/>
+                      <w:sz w:val="10"/>
+                    </w:rPr>
+                    <w:t>代碼</w:t>
+                  </w:r>
+                  <w:proofErr w:type="spellEnd"/>
+                  <w:r>
+                    <w:rPr>
+                      <w:rFonts w:eastAsia="微軟正黑體"/>
+                      <w:i/>
+                      <w:color w:val="C00000"/>
+                      <w:sz w:val="10"/>
+                    </w:rPr>
+                    <w:t xml:space="preserve">  E.g.</w:t>
+                  </w:r>
+                  <w:proofErr w:type="gramEnd"/>
+                  <w:r>
+                    <w:rPr>
+                      <w:rFonts w:eastAsia="微軟正黑體"/>
+                      <w:i/>
+                      <w:color w:val="C00000"/>
+                      <w:sz w:val="10"/>
+                    </w:rPr>
+                    <w:t xml:space="preserve"> TRAINING-CODE</w:t>
+                  </w:r>
                 </w:p>
               </w:tc>
               <w:tc>
@@ -465,6 +667,46 @@
                       <w:sz w:val="11"/>
                     </w:rPr>
                     <w:t>Account No.</w:t>
+                  </w:r>
+                  <w:r>
+                    <w:rPr>
+                      <w:rFonts w:eastAsia="微軟正黑體"/>
+                      <w:i/>
+                      <w:color w:val="C00000"/>
+                      <w:sz w:val="10"/>
+                    </w:rPr>
+                    <w:br/>
+                  </w:r>
+                  <w:proofErr w:type="spellStart"/>
+                  <w:proofErr w:type="gramStart"/>
+                  <w:r>
+                    <w:rPr>
+                      <w:rFonts w:eastAsia="微軟正黑體"/>
+                      <w:i/>
+                      <w:color w:val="C00000"/>
+                      <w:sz w:val="10"/>
+                    </w:rPr>
+                    <w:t>代理帳號</w:t>
+                  </w:r>
+                  <w:proofErr w:type="spellEnd"/>
+                  <w:r>
+                    <w:rPr>
+                      <w:rFonts w:eastAsia="微軟正黑體"/>
+                      <w:i/>
+                      <w:color w:val="C00000"/>
+                      <w:sz w:val="10"/>
+                    </w:rPr>
+                    <w:t xml:space="preserve">  E.g.</w:t>
+                  </w:r>
+                  <w:proofErr w:type="gramEnd"/>
+                  <w:r>
+                    <w:rPr>
+                      <w:rFonts w:eastAsia="微軟正黑體"/>
+                      <w:i/>
+                      <w:color w:val="C00000"/>
+                      <w:sz w:val="10"/>
+                    </w:rPr>
+                    <w:t xml:space="preserve"> SAMPLE-AGT-01</w:t>
                   </w:r>
                 </w:p>
               </w:tc>
@@ -490,7 +732,72 @@
                       <w:b/>
                       <w:sz w:val="11"/>
                     </w:rPr>
-                    <w:t>Airport of Departure (Addr. of First Carrier) and Requested Routing</w:t>
+                    <w:t>Airport of Departure (</w:t>
+                  </w:r>
+                  <w:proofErr w:type="spellStart"/>
+                  <w:r>
+                    <w:rPr>
+                      <w:b/>
+                      <w:sz w:val="11"/>
+                    </w:rPr>
+                    <w:t>Addr</w:t>
+                  </w:r>
+                  <w:proofErr w:type="spellEnd"/>
+                  <w:r>
+                    <w:rPr>
+                      <w:b/>
+                      <w:sz w:val="11"/>
+                    </w:rPr>
+                    <w:t>. of First Carrier) and Requested Routing</w:t>
+                  </w:r>
+                  <w:r>
+                    <w:rPr>
+                      <w:rFonts w:eastAsia="微軟正黑體"/>
+                      <w:i/>
+                      <w:color w:val="C00000"/>
+                      <w:sz w:val="10"/>
+                    </w:rPr>
+                    <w:br/>
+                  </w:r>
+                  <w:proofErr w:type="spellStart"/>
+                  <w:r>
+                    <w:rPr>
+                      <w:rFonts w:eastAsia="微軟正黑體"/>
+                      <w:i/>
+                      <w:color w:val="C00000"/>
+                      <w:sz w:val="10"/>
+                    </w:rPr>
+                    <w:t>起運機場／</w:t>
+                  </w:r>
+                  <w:proofErr w:type="gramStart"/>
+                  <w:r>
+                    <w:rPr>
+                      <w:rFonts w:eastAsia="微軟正黑體"/>
+                      <w:i/>
+                      <w:color w:val="C00000"/>
+                      <w:sz w:val="10"/>
+                    </w:rPr>
+                    <w:t>路由</w:t>
+                  </w:r>
+                  <w:proofErr w:type="spellEnd"/>
+                  <w:r>
+                    <w:rPr>
+                      <w:rFonts w:eastAsia="微軟正黑體"/>
+                      <w:i/>
+                      <w:color w:val="C00000"/>
+                      <w:sz w:val="10"/>
+                    </w:rPr>
+                    <w:t xml:space="preserve">  E.g.</w:t>
+                  </w:r>
+                  <w:proofErr w:type="gramEnd"/>
+                  <w:r>
+                    <w:rPr>
+                      <w:rFonts w:eastAsia="微軟正黑體"/>
+                      <w:i/>
+                      <w:color w:val="C00000"/>
+                      <w:sz w:val="10"/>
+                    </w:rPr>
+                    <w:t xml:space="preserve"> TPE</w:t>
                   </w:r>
                 </w:p>
               </w:tc>
@@ -547,6 +854,46 @@
                     </w:rPr>
                     <w:t>File No.</w:t>
                   </w:r>
+                  <w:r>
+                    <w:rPr>
+                      <w:rFonts w:eastAsia="微軟正黑體"/>
+                      <w:i/>
+                      <w:color w:val="C00000"/>
+                      <w:sz w:val="10"/>
+                    </w:rPr>
+                    <w:br/>
+                  </w:r>
+                  <w:proofErr w:type="spellStart"/>
+                  <w:proofErr w:type="gramStart"/>
+                  <w:r>
+                    <w:rPr>
+                      <w:rFonts w:eastAsia="微軟正黑體"/>
+                      <w:i/>
+                      <w:color w:val="C00000"/>
+                      <w:sz w:val="10"/>
+                    </w:rPr>
+                    <w:t>案件編號</w:t>
+                  </w:r>
+                  <w:proofErr w:type="spellEnd"/>
+                  <w:r>
+                    <w:rPr>
+                      <w:rFonts w:eastAsia="微軟正黑體"/>
+                      <w:i/>
+                      <w:color w:val="C00000"/>
+                      <w:sz w:val="10"/>
+                    </w:rPr>
+                    <w:t xml:space="preserve">  E.g.</w:t>
+                  </w:r>
+                  <w:proofErr w:type="gramEnd"/>
+                  <w:r>
+                    <w:rPr>
+                      <w:rFonts w:eastAsia="微軟正黑體"/>
+                      <w:i/>
+                      <w:color w:val="C00000"/>
+                      <w:sz w:val="10"/>
+                    </w:rPr>
+                    <w:t xml:space="preserve"> TRN-001</w:t>
+                  </w:r>
                 </w:p>
               </w:tc>
               <w:tc>
@@ -569,6 +916,46 @@
                       <w:sz w:val="11"/>
                     </w:rPr>
                     <w:t>Optional Shipping Information</w:t>
+                  </w:r>
+                  <w:r>
+                    <w:rPr>
+                      <w:rFonts w:eastAsia="微軟正黑體"/>
+                      <w:i/>
+                      <w:color w:val="C00000"/>
+                      <w:sz w:val="10"/>
+                    </w:rPr>
+                    <w:br/>
+                  </w:r>
+                  <w:proofErr w:type="spellStart"/>
+                  <w:proofErr w:type="gramStart"/>
+                  <w:r>
+                    <w:rPr>
+                      <w:rFonts w:eastAsia="微軟正黑體"/>
+                      <w:i/>
+                      <w:color w:val="C00000"/>
+                      <w:sz w:val="10"/>
+                    </w:rPr>
+                    <w:t>選填運送資料</w:t>
+                  </w:r>
+                  <w:proofErr w:type="spellEnd"/>
+                  <w:r>
+                    <w:rPr>
+                      <w:rFonts w:eastAsia="微軟正黑體"/>
+                      <w:i/>
+                      <w:color w:val="C00000"/>
+                      <w:sz w:val="10"/>
+                    </w:rPr>
+                    <w:t xml:space="preserve">  E.g.</w:t>
+                  </w:r>
+                  <w:proofErr w:type="gramEnd"/>
+                  <w:r>
+                    <w:rPr>
+                      <w:rFonts w:eastAsia="微軟正黑體"/>
+                      <w:i/>
+                      <w:color w:val="C00000"/>
+                      <w:sz w:val="10"/>
+                    </w:rPr>
+                    <w:t xml:space="preserve"> TRAINING REF.</w:t>
                   </w:r>
                 </w:p>
               </w:tc>
@@ -1041,10 +1428,30 @@
               <w:spacing w:after="0" w:line="240" w:lineRule="auto"/>
               <w:jc w:val="center"/>
               <w:rPr>
-                <w:rFonts w:eastAsia="新細明體" w:hint="eastAsia"/>
+                <w:rFonts w:eastAsia="新細明體"/>
                 <w:lang w:eastAsia="zh-TW"/>
               </w:rPr>
             </w:pPr>
+            <w:proofErr w:type="spellStart"/>
+            <w:r>
+              <w:rPr>
+                <w:rFonts w:eastAsia="微軟正黑體"/>
+                <w:color w:val="C00000"/>
+                <w:sz w:val="10"/>
+              </w:rPr>
+              <w:t>下一站</w:t>
+            </w:r>
+            <w:proofErr w:type="spellEnd"/>
+            <w:r>
+              <w:rPr>
+                <w:rFonts w:eastAsia="微軟正黑體"/>
+                <w:i/>
+                <w:color w:val="C00000"/>
+                <w:sz w:val="10"/>
+              </w:rPr>
+              <w:br/>
+              <w:t>E.g. HKG</w:t>
+            </w:r>
           </w:p>
         </w:tc>
         <w:tc>
@@ -1068,11 +1475,25 @@
               <w:spacing w:after="0" w:line="240" w:lineRule="auto"/>
               <w:jc w:val="center"/>
             </w:pPr>
-            <w:r>
-              <w:rPr>
+            <w:proofErr w:type="spellStart"/>
+            <w:r>
+              <w:rPr>
+                <w:rFonts w:eastAsia="微軟正黑體"/>
+                <w:color w:val="C00000"/>
                 <w:sz w:val="10"/>
               </w:rPr>
-              <w:t>—</w:t>
+              <w:t>第一承運人</w:t>
+            </w:r>
+            <w:proofErr w:type="spellEnd"/>
+            <w:r>
+              <w:rPr>
+                <w:rFonts w:eastAsia="微軟正黑體"/>
+                <w:i/>
+                <w:color w:val="C00000"/>
+                <w:sz w:val="10"/>
+              </w:rPr>
+              <w:br/>
+              <w:t>E.g. SAMPLE AIR</w:t>
             </w:r>
           </w:p>
         </w:tc>
@@ -1097,11 +1518,25 @@
               <w:spacing w:after="0" w:line="240" w:lineRule="auto"/>
               <w:jc w:val="center"/>
             </w:pPr>
-            <w:r>
-              <w:rPr>
+            <w:proofErr w:type="spellStart"/>
+            <w:r>
+              <w:rPr>
+                <w:rFonts w:eastAsia="微軟正黑體"/>
+                <w:color w:val="C00000"/>
                 <w:sz w:val="10"/>
               </w:rPr>
-              <w:t>—</w:t>
+              <w:t>後續路由</w:t>
+            </w:r>
+            <w:proofErr w:type="spellEnd"/>
+            <w:r>
+              <w:rPr>
+                <w:rFonts w:eastAsia="微軟正黑體"/>
+                <w:i/>
+                <w:color w:val="C00000"/>
+                <w:sz w:val="10"/>
+              </w:rPr>
+              <w:br/>
+              <w:t>E.g. NRT</w:t>
             </w:r>
           </w:p>
         </w:tc>
@@ -1127,6 +1562,16 @@
               <w:spacing w:after="0" w:line="240" w:lineRule="auto"/>
               <w:jc w:val="center"/>
             </w:pPr>
+            <w:proofErr w:type="spellStart"/>
+            <w:r>
+              <w:rPr>
+                <w:rFonts w:eastAsia="微軟正黑體"/>
+                <w:color w:val="C00000"/>
+                <w:sz w:val="10"/>
+              </w:rPr>
+              <w:t>承運人</w:t>
+            </w:r>
+            <w:proofErr w:type="spellEnd"/>
           </w:p>
         </w:tc>
         <w:tc>
@@ -1150,6 +1595,16 @@
               <w:spacing w:after="0" w:line="240" w:lineRule="auto"/>
               <w:jc w:val="center"/>
             </w:pPr>
+            <w:proofErr w:type="spellStart"/>
+            <w:r>
+              <w:rPr>
+                <w:rFonts w:eastAsia="微軟正黑體"/>
+                <w:color w:val="C00000"/>
+                <w:sz w:val="10"/>
+              </w:rPr>
+              <w:t>下一站</w:t>
+            </w:r>
+            <w:proofErr w:type="spellEnd"/>
           </w:p>
         </w:tc>
         <w:tc>
@@ -1173,6 +1628,16 @@
               <w:spacing w:after="0" w:line="240" w:lineRule="auto"/>
               <w:jc w:val="center"/>
             </w:pPr>
+            <w:proofErr w:type="spellStart"/>
+            <w:r>
+              <w:rPr>
+                <w:rFonts w:eastAsia="微軟正黑體"/>
+                <w:color w:val="C00000"/>
+                <w:sz w:val="10"/>
+              </w:rPr>
+              <w:t>承運人</w:t>
+            </w:r>
+            <w:proofErr w:type="spellEnd"/>
           </w:p>
         </w:tc>
         <w:tc>
@@ -1196,6 +1661,26 @@
               <w:spacing w:after="0" w:line="240" w:lineRule="auto"/>
               <w:jc w:val="center"/>
             </w:pPr>
+            <w:proofErr w:type="spellStart"/>
+            <w:r>
+              <w:rPr>
+                <w:rFonts w:eastAsia="微軟正黑體"/>
+                <w:color w:val="C00000"/>
+                <w:sz w:val="10"/>
+              </w:rPr>
+              <w:t>費用幣別</w:t>
+            </w:r>
+            <w:proofErr w:type="spellEnd"/>
+            <w:r>
+              <w:rPr>
+                <w:rFonts w:eastAsia="微軟正黑體"/>
+                <w:i/>
+                <w:color w:val="C00000"/>
+                <w:sz w:val="10"/>
+              </w:rPr>
+              <w:br/>
+              <w:t>E.g. USD</w:t>
+            </w:r>
           </w:p>
         </w:tc>
         <w:tc>
@@ -1219,11 +1704,25 @@
               <w:spacing w:after="0" w:line="240" w:lineRule="auto"/>
               <w:jc w:val="center"/>
             </w:pPr>
-            <w:r>
-              <w:rPr>
+            <w:proofErr w:type="spellStart"/>
+            <w:r>
+              <w:rPr>
+                <w:rFonts w:eastAsia="微軟正黑體"/>
+                <w:color w:val="C00000"/>
                 <w:sz w:val="10"/>
               </w:rPr>
-              <w:t>—</w:t>
+              <w:t>付款代碼</w:t>
+            </w:r>
+            <w:proofErr w:type="spellEnd"/>
+            <w:r>
+              <w:rPr>
+                <w:rFonts w:eastAsia="微軟正黑體"/>
+                <w:i/>
+                <w:color w:val="C00000"/>
+                <w:sz w:val="10"/>
+              </w:rPr>
+              <w:br/>
+              <w:t>E.g. PP</w:t>
             </w:r>
           </w:p>
         </w:tc>
@@ -1247,7 +1746,30 @@
             <w:pPr>
               <w:spacing w:after="0" w:line="240" w:lineRule="auto"/>
               <w:jc w:val="center"/>
+              <w:rPr>
+                <w:lang w:eastAsia="zh-TW"/>
+              </w:rPr>
             </w:pPr>
+            <w:r>
+              <w:rPr>
+                <w:rFonts w:eastAsia="微軟正黑體"/>
+                <w:color w:val="C00000"/>
+                <w:sz w:val="10"/>
+                <w:lang w:eastAsia="zh-TW"/>
+              </w:rPr>
+              <w:t>重量／價值費用</w:t>
+            </w:r>
+            <w:r>
+              <w:rPr>
+                <w:rFonts w:eastAsia="微軟正黑體"/>
+                <w:i/>
+                <w:color w:val="C00000"/>
+                <w:sz w:val="10"/>
+                <w:lang w:eastAsia="zh-TW"/>
+              </w:rPr>
+              <w:br/>
+              <w:t>E.g. PPD</w:t>
+            </w:r>
           </w:p>
         </w:tc>
         <w:tc>
@@ -1271,7 +1793,30 @@
             <w:pPr>
               <w:spacing w:after="0" w:line="240" w:lineRule="auto"/>
               <w:jc w:val="center"/>
+              <w:rPr>
+                <w:lang w:eastAsia="zh-TW"/>
+              </w:rPr>
             </w:pPr>
+            <w:r>
+              <w:rPr>
+                <w:rFonts w:eastAsia="微軟正黑體"/>
+                <w:color w:val="C00000"/>
+                <w:sz w:val="10"/>
+                <w:lang w:eastAsia="zh-TW"/>
+              </w:rPr>
+              <w:t>運送申報價值</w:t>
+            </w:r>
+            <w:r>
+              <w:rPr>
+                <w:rFonts w:eastAsia="微軟正黑體"/>
+                <w:i/>
+                <w:color w:val="C00000"/>
+                <w:sz w:val="10"/>
+                <w:lang w:eastAsia="zh-TW"/>
+              </w:rPr>
+              <w:br/>
+              <w:t>E.g. NVD</w:t>
+            </w:r>
           </w:p>
         </w:tc>
         <w:tc>
@@ -1294,7 +1839,30 @@
             <w:pPr>
               <w:spacing w:after="0" w:line="240" w:lineRule="auto"/>
               <w:jc w:val="center"/>
+              <w:rPr>
+                <w:lang w:eastAsia="zh-TW"/>
+              </w:rPr>
             </w:pPr>
+            <w:r>
+              <w:rPr>
+                <w:rFonts w:eastAsia="微軟正黑體"/>
+                <w:color w:val="C00000"/>
+                <w:sz w:val="10"/>
+                <w:lang w:eastAsia="zh-TW"/>
+              </w:rPr>
+              <w:t>海關申報價值</w:t>
+            </w:r>
+            <w:r>
+              <w:rPr>
+                <w:rFonts w:eastAsia="微軟正黑體"/>
+                <w:i/>
+                <w:color w:val="C00000"/>
+                <w:sz w:val="10"/>
+                <w:lang w:eastAsia="zh-TW"/>
+              </w:rPr>
+              <w:br/>
+              <w:t>E.g. USD 1,000</w:t>
+            </w:r>
           </w:p>
         </w:tc>
         <w:tc>
@@ -1317,6 +1885,9 @@
             <w:pPr>
               <w:spacing w:after="0" w:line="240" w:lineRule="auto"/>
               <w:jc w:val="center"/>
+              <w:rPr>
+                <w:lang w:eastAsia="zh-TW"/>
+              </w:rPr>
             </w:pPr>
           </w:p>
         </w:tc>
@@ -1340,6 +1911,9 @@
             <w:pPr>
               <w:spacing w:after="0" w:line="240" w:lineRule="auto"/>
               <w:jc w:val="center"/>
+              <w:rPr>
+                <w:lang w:eastAsia="zh-TW"/>
+              </w:rPr>
             </w:pPr>
           </w:p>
         </w:tc>
@@ -1378,6 +1952,34 @@
               </w:rPr>
               <w:t>Airport of Destination</w:t>
             </w:r>
+            <w:r>
+              <w:rPr>
+                <w:rFonts w:eastAsia="微軟正黑體"/>
+                <w:color w:val="C00000"/>
+                <w:sz w:val="11"/>
+              </w:rPr>
+              <w:br/>
+            </w:r>
+            <w:proofErr w:type="spellStart"/>
+            <w:r>
+              <w:rPr>
+                <w:rFonts w:eastAsia="微軟正黑體"/>
+                <w:color w:val="C00000"/>
+                <w:sz w:val="11"/>
+              </w:rPr>
+              <w:t>目的地機場</w:t>
+            </w:r>
+            <w:proofErr w:type="spellEnd"/>
+            <w:r>
+              <w:rPr>
+                <w:rFonts w:eastAsia="微軟正黑體"/>
+                <w:i/>
+                <w:color w:val="C00000"/>
+                <w:sz w:val="11"/>
+              </w:rPr>
+              <w:br/>
+              <w:t>E.g. NRT</w:t>
+            </w:r>
           </w:p>
         </w:tc>
         <w:tc>
@@ -1439,6 +2041,55 @@
                 <w:sz w:val="10"/>
               </w:rPr>
               <w:t>Amount of Insurance</w:t>
+            </w:r>
+            <w:r>
+              <w:rPr>
+                <w:rFonts w:eastAsia="微軟正黑體"/>
+                <w:i/>
+                <w:color w:val="C00000"/>
+                <w:sz w:val="10"/>
+              </w:rPr>
+              <w:br/>
+            </w:r>
+            <w:proofErr w:type="spellStart"/>
+            <w:r>
+              <w:rPr>
+                <w:rFonts w:eastAsia="微軟正黑體"/>
+                <w:i/>
+                <w:color w:val="C00000"/>
+                <w:sz w:val="10"/>
+              </w:rPr>
+              <w:t>保險金額，</w:t>
+            </w:r>
+            <w:proofErr w:type="gramStart"/>
+            <w:r>
+              <w:rPr>
+                <w:rFonts w:eastAsia="微軟正黑體"/>
+                <w:i/>
+                <w:color w:val="C00000"/>
+                <w:sz w:val="10"/>
+              </w:rPr>
+              <w:t>適用時</w:t>
+            </w:r>
+            <w:proofErr w:type="spellEnd"/>
+            <w:r>
+              <w:rPr>
+                <w:rFonts w:eastAsia="微軟正黑體"/>
+                <w:i/>
+                <w:color w:val="C00000"/>
+                <w:sz w:val="10"/>
+              </w:rPr>
+              <w:t xml:space="preserve">  E.g.</w:t>
+            </w:r>
+            <w:proofErr w:type="gramEnd"/>
+            <w:r>
+              <w:rPr>
+                <w:rFonts w:eastAsia="微軟正黑體"/>
+                <w:i/>
+                <w:color w:val="C00000"/>
+                <w:sz w:val="10"/>
+              </w:rPr>
+              <w:t xml:space="preserve"> USD 1,000</w:t>
             </w:r>
           </w:p>
         </w:tc>
@@ -1526,6 +2177,55 @@
                 <w:sz w:val="10"/>
               </w:rPr>
               <w:t>Handling Information</w:t>
+            </w:r>
+            <w:r>
+              <w:rPr>
+                <w:rFonts w:eastAsia="微軟正黑體"/>
+                <w:i/>
+                <w:color w:val="C00000"/>
+                <w:sz w:val="11"/>
+              </w:rPr>
+              <w:br/>
+            </w:r>
+            <w:proofErr w:type="spellStart"/>
+            <w:r>
+              <w:rPr>
+                <w:rFonts w:eastAsia="微軟正黑體"/>
+                <w:i/>
+                <w:color w:val="C00000"/>
+                <w:sz w:val="11"/>
+              </w:rPr>
+              <w:t>特殊處理／</w:t>
+            </w:r>
+            <w:proofErr w:type="gramStart"/>
+            <w:r>
+              <w:rPr>
+                <w:rFonts w:eastAsia="微軟正黑體"/>
+                <w:i/>
+                <w:color w:val="C00000"/>
+                <w:sz w:val="11"/>
+              </w:rPr>
+              <w:t>文件</w:t>
+            </w:r>
+            <w:proofErr w:type="spellEnd"/>
+            <w:r>
+              <w:rPr>
+                <w:rFonts w:eastAsia="微軟正黑體"/>
+                <w:i/>
+                <w:color w:val="C00000"/>
+                <w:sz w:val="11"/>
+              </w:rPr>
+              <w:t xml:space="preserve">  E.g.</w:t>
+            </w:r>
+            <w:proofErr w:type="gramEnd"/>
+            <w:r>
+              <w:rPr>
+                <w:rFonts w:eastAsia="微軟正黑體"/>
+                <w:i/>
+                <w:color w:val="C00000"/>
+                <w:sz w:val="11"/>
+              </w:rPr>
+              <w:t xml:space="preserve"> KEEP DRY</w:t>
             </w:r>
           </w:p>
           <w:p>
@@ -1603,6 +2303,24 @@
               </w:rPr>
               <w:t>SCI</w:t>
             </w:r>
+            <w:r>
+              <w:rPr>
+                <w:rFonts w:eastAsia="微軟正黑體"/>
+                <w:color w:val="C00000"/>
+                <w:sz w:val="7"/>
+              </w:rPr>
+              <w:t xml:space="preserve"> </w:t>
+            </w:r>
+            <w:proofErr w:type="spellStart"/>
+            <w:r>
+              <w:rPr>
+                <w:rFonts w:eastAsia="微軟正黑體"/>
+                <w:color w:val="C00000"/>
+                <w:sz w:val="7"/>
+              </w:rPr>
+              <w:t>海關碼</w:t>
+            </w:r>
+            <w:proofErr w:type="spellEnd"/>
           </w:p>
         </w:tc>
         <w:tc>
@@ -1754,8 +2472,17 @@
                 <w:b/>
                 <w:sz w:val="10"/>
               </w:rPr>
-              <w:t>kg/lb</w:t>
-            </w:r>
+              <w:t>kg/</w:t>
+            </w:r>
+            <w:proofErr w:type="spellStart"/>
+            <w:r>
+              <w:rPr>
+                <w:b/>
+                <w:sz w:val="10"/>
+              </w:rPr>
+              <w:t>lb</w:t>
+            </w:r>
+            <w:proofErr w:type="spellEnd"/>
           </w:p>
         </w:tc>
         <w:tc>
@@ -1952,11 +2679,25 @@
               <w:spacing w:after="0" w:line="240" w:lineRule="auto"/>
               <w:jc w:val="center"/>
             </w:pPr>
-            <w:r>
-              <w:rPr>
+            <w:proofErr w:type="spellStart"/>
+            <w:r>
+              <w:rPr>
+                <w:rFonts w:eastAsia="微軟正黑體"/>
+                <w:color w:val="C00000"/>
                 <w:sz w:val="11"/>
               </w:rPr>
-              <w:t>1</w:t>
+              <w:t>件數</w:t>
+            </w:r>
+            <w:proofErr w:type="spellEnd"/>
+            <w:r>
+              <w:rPr>
+                <w:rFonts w:eastAsia="微軟正黑體"/>
+                <w:i/>
+                <w:color w:val="C00000"/>
+                <w:sz w:val="10"/>
+              </w:rPr>
+              <w:br/>
+              <w:t>E.g. 2 PCS</w:t>
             </w:r>
           </w:p>
         </w:tc>
@@ -1981,11 +2722,25 @@
               <w:spacing w:after="0" w:line="240" w:lineRule="auto"/>
               <w:jc w:val="center"/>
             </w:pPr>
-            <w:r>
-              <w:rPr>
+            <w:proofErr w:type="spellStart"/>
+            <w:r>
+              <w:rPr>
+                <w:rFonts w:eastAsia="微軟正黑體"/>
+                <w:color w:val="C00000"/>
                 <w:sz w:val="11"/>
               </w:rPr>
-              <w:t>000.00</w:t>
+              <w:t>毛重</w:t>
+            </w:r>
+            <w:proofErr w:type="spellEnd"/>
+            <w:r>
+              <w:rPr>
+                <w:rFonts w:eastAsia="微軟正黑體"/>
+                <w:i/>
+                <w:color w:val="C00000"/>
+                <w:sz w:val="10"/>
+              </w:rPr>
+              <w:br/>
+              <w:t>E.g. 125.0</w:t>
             </w:r>
           </w:p>
         </w:tc>
@@ -2010,11 +2765,25 @@
               <w:spacing w:after="0" w:line="240" w:lineRule="auto"/>
               <w:jc w:val="center"/>
             </w:pPr>
-            <w:r>
-              <w:rPr>
+            <w:proofErr w:type="spellStart"/>
+            <w:r>
+              <w:rPr>
+                <w:rFonts w:eastAsia="微軟正黑體"/>
+                <w:color w:val="C00000"/>
                 <w:sz w:val="11"/>
               </w:rPr>
-              <w:t>KGS</w:t>
+              <w:t>單位</w:t>
+            </w:r>
+            <w:proofErr w:type="spellEnd"/>
+            <w:r>
+              <w:rPr>
+                <w:rFonts w:eastAsia="微軟正黑體"/>
+                <w:i/>
+                <w:color w:val="C00000"/>
+                <w:sz w:val="10"/>
+              </w:rPr>
+              <w:br/>
+              <w:t>E.g. KGS</w:t>
             </w:r>
           </w:p>
         </w:tc>
@@ -2039,12 +2808,39 @@
             <w:pPr>
               <w:spacing w:after="0" w:line="240" w:lineRule="auto"/>
               <w:jc w:val="center"/>
+              <w:rPr>
+                <w:lang w:eastAsia="zh-TW"/>
+              </w:rPr>
             </w:pPr>
             <w:r>
               <w:rPr>
+                <w:rFonts w:eastAsia="微軟正黑體"/>
+                <w:color w:val="C00000"/>
                 <w:sz w:val="11"/>
-              </w:rPr>
-              <w:t>Q</w:t>
+                <w:lang w:eastAsia="zh-TW"/>
+              </w:rPr>
+              <w:t>運價類別／商品費率碼</w:t>
+            </w:r>
+            <w:r>
+              <w:rPr>
+                <w:rFonts w:eastAsia="微軟正黑體"/>
+                <w:i/>
+                <w:color w:val="C00000"/>
+                <w:sz w:val="10"/>
+                <w:lang w:eastAsia="zh-TW"/>
+              </w:rPr>
+              <w:br/>
+              <w:t xml:space="preserve">E.g. Q / </w:t>
+            </w:r>
+            <w:r>
+              <w:rPr>
+                <w:rFonts w:eastAsia="微軟正黑體"/>
+                <w:i/>
+                <w:color w:val="C00000"/>
+                <w:sz w:val="10"/>
+                <w:lang w:eastAsia="zh-TW"/>
+              </w:rPr>
+              <w:t>依規則</w:t>
             </w:r>
           </w:p>
         </w:tc>
@@ -2069,11 +2865,25 @@
               <w:spacing w:after="0" w:line="240" w:lineRule="auto"/>
               <w:jc w:val="center"/>
             </w:pPr>
-            <w:r>
-              <w:rPr>
+            <w:proofErr w:type="spellStart"/>
+            <w:r>
+              <w:rPr>
+                <w:rFonts w:eastAsia="微軟正黑體"/>
+                <w:color w:val="C00000"/>
                 <w:sz w:val="11"/>
               </w:rPr>
-              <w:t>000.00</w:t>
+              <w:t>計費重量</w:t>
+            </w:r>
+            <w:proofErr w:type="spellEnd"/>
+            <w:r>
+              <w:rPr>
+                <w:rFonts w:eastAsia="微軟正黑體"/>
+                <w:i/>
+                <w:color w:val="C00000"/>
+                <w:sz w:val="10"/>
+              </w:rPr>
+              <w:br/>
+              <w:t>E.g. 130.0</w:t>
             </w:r>
           </w:p>
         </w:tc>
@@ -2098,11 +2908,25 @@
               <w:spacing w:after="0" w:line="240" w:lineRule="auto"/>
               <w:jc w:val="center"/>
             </w:pPr>
-            <w:r>
-              <w:rPr>
+            <w:proofErr w:type="spellStart"/>
+            <w:r>
+              <w:rPr>
+                <w:rFonts w:eastAsia="微軟正黑體"/>
+                <w:color w:val="C00000"/>
                 <w:sz w:val="11"/>
               </w:rPr>
-              <w:t>AS ARRANGED</w:t>
+              <w:t>費率</w:t>
+            </w:r>
+            <w:proofErr w:type="spellEnd"/>
+            <w:r>
+              <w:rPr>
+                <w:rFonts w:eastAsia="微軟正黑體"/>
+                <w:i/>
+                <w:color w:val="C00000"/>
+                <w:sz w:val="10"/>
+              </w:rPr>
+              <w:br/>
+              <w:t>E.g. 5.00</w:t>
             </w:r>
           </w:p>
         </w:tc>
@@ -2127,11 +2951,25 @@
               <w:spacing w:after="0" w:line="240" w:lineRule="auto"/>
               <w:jc w:val="center"/>
             </w:pPr>
-            <w:r>
-              <w:rPr>
+            <w:proofErr w:type="spellStart"/>
+            <w:r>
+              <w:rPr>
+                <w:rFonts w:eastAsia="微軟正黑體"/>
+                <w:color w:val="C00000"/>
                 <w:sz w:val="11"/>
               </w:rPr>
-              <w:t>AS ARRANGED</w:t>
+              <w:t>運費小計</w:t>
+            </w:r>
+            <w:proofErr w:type="spellEnd"/>
+            <w:r>
+              <w:rPr>
+                <w:rFonts w:eastAsia="微軟正黑體"/>
+                <w:i/>
+                <w:color w:val="C00000"/>
+                <w:sz w:val="10"/>
+              </w:rPr>
+              <w:br/>
+              <w:t>E.g. 650.00</w:t>
             </w:r>
           </w:p>
         </w:tc>
@@ -2155,25 +2993,25 @@
             <w:pPr>
               <w:spacing w:after="0" w:line="240" w:lineRule="auto"/>
             </w:pPr>
-            <w:r>
-              <w:rPr>
+            <w:proofErr w:type="spellStart"/>
+            <w:r>
+              <w:rPr>
+                <w:rFonts w:eastAsia="微軟正黑體"/>
+                <w:color w:val="C00000"/>
                 <w:sz w:val="11"/>
               </w:rPr>
-              <w:t>SAMPLE CARGO DESCRIPTION</w:t>
-            </w:r>
-            <w:r>
-              <w:rPr>
-                <w:sz w:val="11"/>
+              <w:t>品名／數量／尺寸</w:t>
+            </w:r>
+            <w:proofErr w:type="spellEnd"/>
+            <w:r>
+              <w:rPr>
+                <w:rFonts w:eastAsia="微軟正黑體"/>
+                <w:i/>
+                <w:color w:val="C00000"/>
+                <w:sz w:val="10"/>
               </w:rPr>
               <w:br/>
-              <w:t>DIMENSIONS / VOLUME</w:t>
-            </w:r>
-            <w:r>
-              <w:rPr>
-                <w:sz w:val="11"/>
-              </w:rPr>
-              <w:br/>
-              <w:t>REFERENCE / INVOICE NO.</w:t>
+              <w:t>E.g. TRAINING PARTS / 100 PCS / 50x40x30 CM x2</w:t>
             </w:r>
           </w:p>
         </w:tc>
@@ -2419,7 +3257,70 @@
                 <w:b/>
                 <w:sz w:val="11"/>
               </w:rPr>
-              <w:t>Prepaid        Weight        Collect</w:t>
+              <w:t xml:space="preserve">Prepaid        Weight        </w:t>
+            </w:r>
+            <w:proofErr w:type="gramStart"/>
+            <w:r>
+              <w:rPr>
+                <w:b/>
+                <w:sz w:val="11"/>
+              </w:rPr>
+              <w:t>Collect</w:t>
+            </w:r>
+            <w:r>
+              <w:rPr>
+                <w:rFonts w:eastAsia="微軟正黑體"/>
+                <w:color w:val="C00000"/>
+                <w:sz w:val="11"/>
+              </w:rPr>
+              <w:t xml:space="preserve">  |</w:t>
+            </w:r>
+            <w:proofErr w:type="gramEnd"/>
+            <w:r>
+              <w:rPr>
+                <w:rFonts w:eastAsia="微軟正黑體"/>
+                <w:color w:val="C00000"/>
+                <w:sz w:val="11"/>
+              </w:rPr>
+              <w:t xml:space="preserve">  </w:t>
+            </w:r>
+            <w:proofErr w:type="spellStart"/>
+            <w:r>
+              <w:rPr>
+                <w:rFonts w:eastAsia="微軟正黑體"/>
+                <w:color w:val="C00000"/>
+                <w:sz w:val="11"/>
+              </w:rPr>
+              <w:t>重量運費預付／</w:t>
+            </w:r>
+            <w:proofErr w:type="gramStart"/>
+            <w:r>
+              <w:rPr>
+                <w:rFonts w:eastAsia="微軟正黑體"/>
+                <w:color w:val="C00000"/>
+                <w:sz w:val="11"/>
+              </w:rPr>
+              <w:t>到付</w:t>
+            </w:r>
+            <w:proofErr w:type="spellEnd"/>
+            <w:r>
+              <w:rPr>
+                <w:rFonts w:eastAsia="微軟正黑體"/>
+                <w:i/>
+                <w:color w:val="C00000"/>
+                <w:sz w:val="11"/>
+              </w:rPr>
+              <w:t xml:space="preserve">  E.g.</w:t>
+            </w:r>
+            <w:proofErr w:type="gramEnd"/>
+            <w:r>
+              <w:rPr>
+                <w:rFonts w:eastAsia="微軟正黑體"/>
+                <w:i/>
+                <w:color w:val="C00000"/>
+                <w:sz w:val="11"/>
+              </w:rPr>
+              <w:t xml:space="preserve"> PREPAID 650.00</w:t>
             </w:r>
           </w:p>
         </w:tc>
@@ -2479,6 +3380,44 @@
                 <w:sz w:val="11"/>
               </w:rPr>
               <w:br/>
+            </w:r>
+            <w:r>
+              <w:rPr>
+                <w:rFonts w:eastAsia="微軟正黑體"/>
+                <w:color w:val="C00000"/>
+                <w:sz w:val="11"/>
+              </w:rPr>
+              <w:t xml:space="preserve">  |  </w:t>
+            </w:r>
+            <w:proofErr w:type="spellStart"/>
+            <w:proofErr w:type="gramStart"/>
+            <w:r>
+              <w:rPr>
+                <w:rFonts w:eastAsia="微軟正黑體"/>
+                <w:color w:val="C00000"/>
+                <w:sz w:val="11"/>
+              </w:rPr>
+              <w:t>其他附加費用</w:t>
+            </w:r>
+            <w:proofErr w:type="spellEnd"/>
+            <w:r>
+              <w:rPr>
+                <w:rFonts w:eastAsia="微軟正黑體"/>
+                <w:i/>
+                <w:color w:val="C00000"/>
+                <w:sz w:val="11"/>
+              </w:rPr>
+              <w:t xml:space="preserve">  E.g.</w:t>
+            </w:r>
+            <w:proofErr w:type="gramEnd"/>
+            <w:r>
+              <w:rPr>
+                <w:rFonts w:eastAsia="微軟正黑體"/>
+                <w:i/>
+                <w:color w:val="C00000"/>
+                <w:sz w:val="11"/>
+              </w:rPr>
+              <w:t xml:space="preserve"> SECURITY 25.00</w:t>
             </w:r>
           </w:p>
         </w:tc>
@@ -2515,7 +3454,62 @@
                 <w:b/>
                 <w:sz w:val="11"/>
               </w:rPr>
-              <w:t>Valuation Charge</w:t>
+              <w:t xml:space="preserve">Valuation </w:t>
+            </w:r>
+            <w:proofErr w:type="gramStart"/>
+            <w:r>
+              <w:rPr>
+                <w:b/>
+                <w:sz w:val="11"/>
+              </w:rPr>
+              <w:t>Charge</w:t>
+            </w:r>
+            <w:r>
+              <w:rPr>
+                <w:rFonts w:eastAsia="微軟正黑體"/>
+                <w:color w:val="C00000"/>
+                <w:sz w:val="11"/>
+              </w:rPr>
+              <w:t xml:space="preserve">  |</w:t>
+            </w:r>
+            <w:proofErr w:type="gramEnd"/>
+            <w:r>
+              <w:rPr>
+                <w:rFonts w:eastAsia="微軟正黑體"/>
+                <w:color w:val="C00000"/>
+                <w:sz w:val="11"/>
+              </w:rPr>
+              <w:t xml:space="preserve">  </w:t>
+            </w:r>
+            <w:proofErr w:type="spellStart"/>
+            <w:proofErr w:type="gramStart"/>
+            <w:r>
+              <w:rPr>
+                <w:rFonts w:eastAsia="微軟正黑體"/>
+                <w:color w:val="C00000"/>
+                <w:sz w:val="11"/>
+              </w:rPr>
+              <w:t>申報價值附加費</w:t>
+            </w:r>
+            <w:proofErr w:type="spellEnd"/>
+            <w:r>
+              <w:rPr>
+                <w:rFonts w:eastAsia="微軟正黑體"/>
+                <w:i/>
+                <w:color w:val="C00000"/>
+                <w:sz w:val="11"/>
+              </w:rPr>
+              <w:t xml:space="preserve">  E.g.</w:t>
+            </w:r>
+            <w:proofErr w:type="gramEnd"/>
+            <w:r>
+              <w:rPr>
+                <w:rFonts w:eastAsia="微軟正黑體"/>
+                <w:i/>
+                <w:color w:val="C00000"/>
+                <w:sz w:val="11"/>
+              </w:rPr>
+              <w:t xml:space="preserve"> 0.00</w:t>
             </w:r>
           </w:p>
         </w:tc>
@@ -2555,12 +3549,60 @@
               <w:spacing w:after="0" w:line="240" w:lineRule="auto"/>
               <w:jc w:val="center"/>
             </w:pPr>
+            <w:proofErr w:type="gramStart"/>
             <w:r>
               <w:rPr>
                 <w:b/>
                 <w:sz w:val="11"/>
               </w:rPr>
               <w:t>Tax</w:t>
+            </w:r>
+            <w:r>
+              <w:rPr>
+                <w:rFonts w:eastAsia="微軟正黑體"/>
+                <w:color w:val="C00000"/>
+                <w:sz w:val="11"/>
+              </w:rPr>
+              <w:t xml:space="preserve">  |</w:t>
+            </w:r>
+            <w:proofErr w:type="gramEnd"/>
+            <w:r>
+              <w:rPr>
+                <w:rFonts w:eastAsia="微軟正黑體"/>
+                <w:color w:val="C00000"/>
+                <w:sz w:val="11"/>
+              </w:rPr>
+              <w:t xml:space="preserve">  </w:t>
+            </w:r>
+            <w:proofErr w:type="spellStart"/>
+            <w:proofErr w:type="gramStart"/>
+            <w:r>
+              <w:rPr>
+                <w:rFonts w:eastAsia="微軟正黑體"/>
+                <w:color w:val="C00000"/>
+                <w:sz w:val="11"/>
+              </w:rPr>
+              <w:t>適用稅費</w:t>
+            </w:r>
+            <w:proofErr w:type="spellEnd"/>
+            <w:r>
+              <w:rPr>
+                <w:rFonts w:eastAsia="微軟正黑體"/>
+                <w:i/>
+                <w:color w:val="C00000"/>
+                <w:sz w:val="11"/>
+              </w:rPr>
+              <w:t xml:space="preserve">  E.g.</w:t>
+            </w:r>
+            <w:proofErr w:type="gramEnd"/>
+            <w:r>
+              <w:rPr>
+                <w:rFonts w:eastAsia="微軟正黑體"/>
+                <w:i/>
+                <w:color w:val="C00000"/>
+                <w:sz w:val="11"/>
+              </w:rPr>
+              <w:t xml:space="preserve"> 0.00</w:t>
             </w:r>
           </w:p>
         </w:tc>
@@ -2605,7 +3647,62 @@
                 <w:b/>
                 <w:sz w:val="11"/>
               </w:rPr>
-              <w:t>Total Other Charges Due Agent</w:t>
+              <w:t xml:space="preserve">Total Other Charges Due </w:t>
+            </w:r>
+            <w:proofErr w:type="gramStart"/>
+            <w:r>
+              <w:rPr>
+                <w:b/>
+                <w:sz w:val="11"/>
+              </w:rPr>
+              <w:t>Agent</w:t>
+            </w:r>
+            <w:r>
+              <w:rPr>
+                <w:rFonts w:eastAsia="微軟正黑體"/>
+                <w:color w:val="C00000"/>
+                <w:sz w:val="10"/>
+              </w:rPr>
+              <w:t xml:space="preserve">  |</w:t>
+            </w:r>
+            <w:proofErr w:type="gramEnd"/>
+            <w:r>
+              <w:rPr>
+                <w:rFonts w:eastAsia="微軟正黑體"/>
+                <w:color w:val="C00000"/>
+                <w:sz w:val="10"/>
+              </w:rPr>
+              <w:t xml:space="preserve">  </w:t>
+            </w:r>
+            <w:proofErr w:type="spellStart"/>
+            <w:proofErr w:type="gramStart"/>
+            <w:r>
+              <w:rPr>
+                <w:rFonts w:eastAsia="微軟正黑體"/>
+                <w:color w:val="C00000"/>
+                <w:sz w:val="10"/>
+              </w:rPr>
+              <w:t>應付代理其他費用</w:t>
+            </w:r>
+            <w:proofErr w:type="spellEnd"/>
+            <w:r>
+              <w:rPr>
+                <w:rFonts w:eastAsia="微軟正黑體"/>
+                <w:i/>
+                <w:color w:val="C00000"/>
+                <w:sz w:val="11"/>
+              </w:rPr>
+              <w:t xml:space="preserve">  E.g.</w:t>
+            </w:r>
+            <w:proofErr w:type="gramEnd"/>
+            <w:r>
+              <w:rPr>
+                <w:rFonts w:eastAsia="微軟正黑體"/>
+                <w:i/>
+                <w:color w:val="C00000"/>
+                <w:sz w:val="11"/>
+              </w:rPr>
+              <w:t xml:space="preserve"> 25.00</w:t>
             </w:r>
           </w:p>
         </w:tc>
@@ -2650,7 +3747,62 @@
                 <w:b/>
                 <w:sz w:val="11"/>
               </w:rPr>
-              <w:t>Total Other Charges Due Carrier</w:t>
+              <w:t xml:space="preserve">Total Other Charges Due </w:t>
+            </w:r>
+            <w:proofErr w:type="gramStart"/>
+            <w:r>
+              <w:rPr>
+                <w:b/>
+                <w:sz w:val="11"/>
+              </w:rPr>
+              <w:t>Carrier</w:t>
+            </w:r>
+            <w:r>
+              <w:rPr>
+                <w:rFonts w:eastAsia="微軟正黑體"/>
+                <w:color w:val="C00000"/>
+                <w:sz w:val="10"/>
+              </w:rPr>
+              <w:t xml:space="preserve">  |</w:t>
+            </w:r>
+            <w:proofErr w:type="gramEnd"/>
+            <w:r>
+              <w:rPr>
+                <w:rFonts w:eastAsia="微軟正黑體"/>
+                <w:color w:val="C00000"/>
+                <w:sz w:val="10"/>
+              </w:rPr>
+              <w:t xml:space="preserve">  </w:t>
+            </w:r>
+            <w:proofErr w:type="spellStart"/>
+            <w:proofErr w:type="gramStart"/>
+            <w:r>
+              <w:rPr>
+                <w:rFonts w:eastAsia="微軟正黑體"/>
+                <w:color w:val="C00000"/>
+                <w:sz w:val="10"/>
+              </w:rPr>
+              <w:t>應付承運人其他費用</w:t>
+            </w:r>
+            <w:proofErr w:type="spellEnd"/>
+            <w:r>
+              <w:rPr>
+                <w:rFonts w:eastAsia="微軟正黑體"/>
+                <w:i/>
+                <w:color w:val="C00000"/>
+                <w:sz w:val="11"/>
+              </w:rPr>
+              <w:t xml:space="preserve">  E.g.</w:t>
+            </w:r>
+            <w:proofErr w:type="gramEnd"/>
+            <w:r>
+              <w:rPr>
+                <w:rFonts w:eastAsia="微軟正黑體"/>
+                <w:i/>
+                <w:color w:val="C00000"/>
+                <w:sz w:val="11"/>
+              </w:rPr>
+              <w:t xml:space="preserve"> 0.00</w:t>
             </w:r>
           </w:p>
         </w:tc>
@@ -2695,7 +3847,62 @@
                 <w:b/>
                 <w:sz w:val="11"/>
               </w:rPr>
-              <w:t>Total Prepaid</w:t>
+              <w:t xml:space="preserve">Total </w:t>
+            </w:r>
+            <w:proofErr w:type="gramStart"/>
+            <w:r>
+              <w:rPr>
+                <w:b/>
+                <w:sz w:val="11"/>
+              </w:rPr>
+              <w:t>Prepaid</w:t>
+            </w:r>
+            <w:r>
+              <w:rPr>
+                <w:rFonts w:eastAsia="微軟正黑體"/>
+                <w:color w:val="C00000"/>
+                <w:sz w:val="11"/>
+              </w:rPr>
+              <w:t xml:space="preserve">  |</w:t>
+            </w:r>
+            <w:proofErr w:type="gramEnd"/>
+            <w:r>
+              <w:rPr>
+                <w:rFonts w:eastAsia="微軟正黑體"/>
+                <w:color w:val="C00000"/>
+                <w:sz w:val="11"/>
+              </w:rPr>
+              <w:t xml:space="preserve">  </w:t>
+            </w:r>
+            <w:proofErr w:type="spellStart"/>
+            <w:proofErr w:type="gramStart"/>
+            <w:r>
+              <w:rPr>
+                <w:rFonts w:eastAsia="微軟正黑體"/>
+                <w:color w:val="C00000"/>
+                <w:sz w:val="11"/>
+              </w:rPr>
+              <w:t>預付合計</w:t>
+            </w:r>
+            <w:proofErr w:type="spellEnd"/>
+            <w:r>
+              <w:rPr>
+                <w:rFonts w:eastAsia="微軟正黑體"/>
+                <w:i/>
+                <w:color w:val="C00000"/>
+                <w:sz w:val="11"/>
+              </w:rPr>
+              <w:t xml:space="preserve">  E.g.</w:t>
+            </w:r>
+            <w:proofErr w:type="gramEnd"/>
+            <w:r>
+              <w:rPr>
+                <w:rFonts w:eastAsia="微軟正黑體"/>
+                <w:i/>
+                <w:color w:val="C00000"/>
+                <w:sz w:val="11"/>
+              </w:rPr>
+              <w:t xml:space="preserve"> 675.00</w:t>
             </w:r>
           </w:p>
         </w:tc>
@@ -2720,7 +3927,62 @@
                 <w:b/>
                 <w:sz w:val="11"/>
               </w:rPr>
-              <w:t>Total Collect</w:t>
+              <w:t xml:space="preserve">Total </w:t>
+            </w:r>
+            <w:proofErr w:type="gramStart"/>
+            <w:r>
+              <w:rPr>
+                <w:b/>
+                <w:sz w:val="11"/>
+              </w:rPr>
+              <w:t>Collect</w:t>
+            </w:r>
+            <w:r>
+              <w:rPr>
+                <w:rFonts w:eastAsia="微軟正黑體"/>
+                <w:color w:val="C00000"/>
+                <w:sz w:val="11"/>
+              </w:rPr>
+              <w:t xml:space="preserve">  |</w:t>
+            </w:r>
+            <w:proofErr w:type="gramEnd"/>
+            <w:r>
+              <w:rPr>
+                <w:rFonts w:eastAsia="微軟正黑體"/>
+                <w:color w:val="C00000"/>
+                <w:sz w:val="11"/>
+              </w:rPr>
+              <w:t xml:space="preserve">  </w:t>
+            </w:r>
+            <w:proofErr w:type="spellStart"/>
+            <w:proofErr w:type="gramStart"/>
+            <w:r>
+              <w:rPr>
+                <w:rFonts w:eastAsia="微軟正黑體"/>
+                <w:color w:val="C00000"/>
+                <w:sz w:val="11"/>
+              </w:rPr>
+              <w:t>到付合計</w:t>
+            </w:r>
+            <w:proofErr w:type="spellEnd"/>
+            <w:r>
+              <w:rPr>
+                <w:rFonts w:eastAsia="微軟正黑體"/>
+                <w:i/>
+                <w:color w:val="C00000"/>
+                <w:sz w:val="11"/>
+              </w:rPr>
+              <w:t xml:space="preserve">  E.g.</w:t>
+            </w:r>
+            <w:proofErr w:type="gramEnd"/>
+            <w:r>
+              <w:rPr>
+                <w:rFonts w:eastAsia="微軟正黑體"/>
+                <w:i/>
+                <w:color w:val="C00000"/>
+                <w:sz w:val="11"/>
+              </w:rPr>
+              <w:t xml:space="preserve"> 0.00</w:t>
             </w:r>
           </w:p>
         </w:tc>
@@ -2781,7 +4043,7 @@
               <w:spacing w:after="0" w:line="240" w:lineRule="auto"/>
               <w:jc w:val="center"/>
               <w:rPr>
-                <w:rFonts w:eastAsia="新細明體" w:hint="eastAsia"/>
+                <w:rFonts w:eastAsia="新細明體"/>
                 <w:lang w:eastAsia="zh-TW"/>
               </w:rPr>
             </w:pPr>
@@ -2790,7 +4052,58 @@
                 <w:b/>
                 <w:sz w:val="11"/>
               </w:rPr>
-              <w:t>Currency Conversion Rates</w:t>
+              <w:t xml:space="preserve">Currency Conversion </w:t>
+            </w:r>
+            <w:proofErr w:type="gramStart"/>
+            <w:r>
+              <w:rPr>
+                <w:b/>
+                <w:sz w:val="11"/>
+              </w:rPr>
+              <w:t>Rates</w:t>
+            </w:r>
+            <w:r>
+              <w:rPr>
+                <w:rFonts w:eastAsia="微軟正黑體"/>
+                <w:color w:val="C00000"/>
+                <w:sz w:val="10"/>
+              </w:rPr>
+              <w:t xml:space="preserve">  |</w:t>
+            </w:r>
+            <w:proofErr w:type="gramEnd"/>
+            <w:r>
+              <w:rPr>
+                <w:rFonts w:eastAsia="微軟正黑體"/>
+                <w:color w:val="C00000"/>
+                <w:sz w:val="10"/>
+              </w:rPr>
+              <w:t xml:space="preserve">  </w:t>
+            </w:r>
+            <w:proofErr w:type="spellStart"/>
+            <w:r>
+              <w:rPr>
+                <w:rFonts w:eastAsia="微軟正黑體"/>
+                <w:color w:val="C00000"/>
+                <w:sz w:val="10"/>
+              </w:rPr>
+              <w:t>目的地幣別換算率，</w:t>
+            </w:r>
+            <w:r>
+              <w:rPr>
+                <w:rFonts w:eastAsia="微軟正黑體"/>
+                <w:color w:val="C00000"/>
+                <w:sz w:val="10"/>
+              </w:rPr>
+              <w:t>Carrier</w:t>
+            </w:r>
+            <w:proofErr w:type="spellEnd"/>
+            <w:r>
+              <w:rPr>
+                <w:rFonts w:eastAsia="微軟正黑體"/>
+                <w:color w:val="C00000"/>
+                <w:sz w:val="10"/>
+              </w:rPr>
+              <w:t xml:space="preserve"> use</w:t>
             </w:r>
           </w:p>
         </w:tc>
@@ -2814,7 +4127,58 @@
                 <w:b/>
                 <w:sz w:val="11"/>
               </w:rPr>
-              <w:t>CC Currency in Dest. Currency</w:t>
+              <w:t xml:space="preserve">CC Currency in Dest. </w:t>
+            </w:r>
+            <w:proofErr w:type="gramStart"/>
+            <w:r>
+              <w:rPr>
+                <w:b/>
+                <w:sz w:val="11"/>
+              </w:rPr>
+              <w:t>Currency</w:t>
+            </w:r>
+            <w:r>
+              <w:rPr>
+                <w:rFonts w:eastAsia="微軟正黑體"/>
+                <w:color w:val="C00000"/>
+                <w:sz w:val="10"/>
+              </w:rPr>
+              <w:t xml:space="preserve">  |</w:t>
+            </w:r>
+            <w:proofErr w:type="gramEnd"/>
+            <w:r>
+              <w:rPr>
+                <w:rFonts w:eastAsia="微軟正黑體"/>
+                <w:color w:val="C00000"/>
+                <w:sz w:val="10"/>
+              </w:rPr>
+              <w:t xml:space="preserve">  </w:t>
+            </w:r>
+            <w:proofErr w:type="spellStart"/>
+            <w:r>
+              <w:rPr>
+                <w:rFonts w:eastAsia="微軟正黑體"/>
+                <w:color w:val="C00000"/>
+                <w:sz w:val="10"/>
+              </w:rPr>
+              <w:t>到付換算金額，</w:t>
+            </w:r>
+            <w:r>
+              <w:rPr>
+                <w:rFonts w:eastAsia="微軟正黑體"/>
+                <w:color w:val="C00000"/>
+                <w:sz w:val="10"/>
+              </w:rPr>
+              <w:t>Carrier</w:t>
+            </w:r>
+            <w:proofErr w:type="spellEnd"/>
+            <w:r>
+              <w:rPr>
+                <w:rFonts w:eastAsia="微軟正黑體"/>
+                <w:color w:val="C00000"/>
+                <w:sz w:val="10"/>
+              </w:rPr>
+              <w:t xml:space="preserve"> use</w:t>
             </w:r>
           </w:p>
         </w:tc>
@@ -2845,7 +4209,70 @@
                 <w:b/>
                 <w:sz w:val="11"/>
               </w:rPr>
-              <w:t>Signature of Shipper or Agent</w:t>
+              <w:t xml:space="preserve">Signature of Shipper or </w:t>
+            </w:r>
+            <w:proofErr w:type="gramStart"/>
+            <w:r>
+              <w:rPr>
+                <w:b/>
+                <w:sz w:val="11"/>
+              </w:rPr>
+              <w:t>Agent</w:t>
+            </w:r>
+            <w:r>
+              <w:rPr>
+                <w:rFonts w:eastAsia="微軟正黑體"/>
+                <w:color w:val="C00000"/>
+                <w:sz w:val="11"/>
+              </w:rPr>
+              <w:t xml:space="preserve">  |</w:t>
+            </w:r>
+            <w:proofErr w:type="gramEnd"/>
+            <w:r>
+              <w:rPr>
+                <w:rFonts w:eastAsia="微軟正黑體"/>
+                <w:color w:val="C00000"/>
+                <w:sz w:val="11"/>
+              </w:rPr>
+              <w:t xml:space="preserve">  </w:t>
+            </w:r>
+            <w:proofErr w:type="spellStart"/>
+            <w:r>
+              <w:rPr>
+                <w:rFonts w:eastAsia="微軟正黑體"/>
+                <w:color w:val="C00000"/>
+                <w:sz w:val="11"/>
+              </w:rPr>
+              <w:t>託運人／</w:t>
+            </w:r>
+            <w:proofErr w:type="gramStart"/>
+            <w:r>
+              <w:rPr>
+                <w:rFonts w:eastAsia="微軟正黑體"/>
+                <w:color w:val="C00000"/>
+                <w:sz w:val="11"/>
+              </w:rPr>
+              <w:t>代理簽署</w:t>
+            </w:r>
+            <w:proofErr w:type="spellEnd"/>
+            <w:r>
+              <w:rPr>
+                <w:rFonts w:eastAsia="微軟正黑體"/>
+                <w:i/>
+                <w:color w:val="C00000"/>
+                <w:sz w:val="11"/>
+              </w:rPr>
+              <w:t xml:space="preserve">  E.g.</w:t>
+            </w:r>
+            <w:proofErr w:type="gramEnd"/>
+            <w:r>
+              <w:rPr>
+                <w:rFonts w:eastAsia="微軟正黑體"/>
+                <w:i/>
+                <w:color w:val="C00000"/>
+                <w:sz w:val="11"/>
+              </w:rPr>
+              <w:t xml:space="preserve"> TRAINING SIGNATURE</w:t>
             </w:r>
           </w:p>
         </w:tc>
@@ -2906,7 +4333,58 @@
                 <w:b/>
                 <w:sz w:val="11"/>
               </w:rPr>
-              <w:t>Charges at Destination</w:t>
+              <w:t xml:space="preserve">Charges at </w:t>
+            </w:r>
+            <w:proofErr w:type="gramStart"/>
+            <w:r>
+              <w:rPr>
+                <w:b/>
+                <w:sz w:val="11"/>
+              </w:rPr>
+              <w:t>Destination</w:t>
+            </w:r>
+            <w:r>
+              <w:rPr>
+                <w:rFonts w:eastAsia="微軟正黑體"/>
+                <w:color w:val="C00000"/>
+                <w:sz w:val="10"/>
+              </w:rPr>
+              <w:t xml:space="preserve">  |</w:t>
+            </w:r>
+            <w:proofErr w:type="gramEnd"/>
+            <w:r>
+              <w:rPr>
+                <w:rFonts w:eastAsia="微軟正黑體"/>
+                <w:color w:val="C00000"/>
+                <w:sz w:val="10"/>
+              </w:rPr>
+              <w:t xml:space="preserve">  </w:t>
+            </w:r>
+            <w:proofErr w:type="spellStart"/>
+            <w:r>
+              <w:rPr>
+                <w:rFonts w:eastAsia="微軟正黑體"/>
+                <w:color w:val="C00000"/>
+                <w:sz w:val="10"/>
+              </w:rPr>
+              <w:t>目的地費用，</w:t>
+            </w:r>
+            <w:r>
+              <w:rPr>
+                <w:rFonts w:eastAsia="微軟正黑體"/>
+                <w:color w:val="C00000"/>
+                <w:sz w:val="10"/>
+              </w:rPr>
+              <w:t>Carrier</w:t>
+            </w:r>
+            <w:proofErr w:type="spellEnd"/>
+            <w:r>
+              <w:rPr>
+                <w:rFonts w:eastAsia="微軟正黑體"/>
+                <w:color w:val="C00000"/>
+                <w:sz w:val="10"/>
+              </w:rPr>
+              <w:t xml:space="preserve"> use</w:t>
             </w:r>
           </w:p>
         </w:tc>
@@ -2937,7 +4415,102 @@
                 <w:b/>
                 <w:sz w:val="10"/>
               </w:rPr>
-              <w:t>Executed on (date)       at (place)       Signature of Issuing Carrier or its Agent</w:t>
+              <w:t>Executed on (</w:t>
+            </w:r>
+            <w:proofErr w:type="gramStart"/>
+            <w:r>
+              <w:rPr>
+                <w:b/>
+                <w:sz w:val="10"/>
+              </w:rPr>
+              <w:t xml:space="preserve">date)   </w:t>
+            </w:r>
+            <w:proofErr w:type="gramEnd"/>
+            <w:r>
+              <w:rPr>
+                <w:b/>
+                <w:sz w:val="10"/>
+              </w:rPr>
+              <w:t xml:space="preserve">    at (</w:t>
+            </w:r>
+            <w:proofErr w:type="gramStart"/>
+            <w:r>
+              <w:rPr>
+                <w:b/>
+                <w:sz w:val="10"/>
+              </w:rPr>
+              <w:t xml:space="preserve">place)   </w:t>
+            </w:r>
+            <w:proofErr w:type="gramEnd"/>
+            <w:r>
+              <w:rPr>
+                <w:b/>
+                <w:sz w:val="10"/>
+              </w:rPr>
+              <w:t xml:space="preserve">    Signature of Issuing Carrier or its </w:t>
+            </w:r>
+            <w:proofErr w:type="gramStart"/>
+            <w:r>
+              <w:rPr>
+                <w:b/>
+                <w:sz w:val="10"/>
+              </w:rPr>
+              <w:t>Agent</w:t>
+            </w:r>
+            <w:r>
+              <w:rPr>
+                <w:rFonts w:eastAsia="微軟正黑體"/>
+                <w:color w:val="C00000"/>
+                <w:sz w:val="10"/>
+              </w:rPr>
+              <w:t xml:space="preserve">  |</w:t>
+            </w:r>
+            <w:proofErr w:type="gramEnd"/>
+            <w:r>
+              <w:rPr>
+                <w:rFonts w:eastAsia="微軟正黑體"/>
+                <w:color w:val="C00000"/>
+                <w:sz w:val="10"/>
+              </w:rPr>
+              <w:t xml:space="preserve">  </w:t>
+            </w:r>
+            <w:proofErr w:type="spellStart"/>
+            <w:r>
+              <w:rPr>
+                <w:rFonts w:eastAsia="微軟正黑體"/>
+                <w:color w:val="C00000"/>
+                <w:sz w:val="10"/>
+              </w:rPr>
+              <w:t>簽發日期／地點；</w:t>
+            </w:r>
+            <w:proofErr w:type="gramStart"/>
+            <w:r>
+              <w:rPr>
+                <w:rFonts w:eastAsia="微軟正黑體"/>
+                <w:color w:val="C00000"/>
+                <w:sz w:val="10"/>
+              </w:rPr>
+              <w:t>承運人或代理簽署</w:t>
+            </w:r>
+            <w:proofErr w:type="spellEnd"/>
+            <w:r>
+              <w:rPr>
+                <w:rFonts w:eastAsia="微軟正黑體"/>
+                <w:i/>
+                <w:color w:val="C00000"/>
+                <w:sz w:val="11"/>
+              </w:rPr>
+              <w:t xml:space="preserve">  E.g.</w:t>
+            </w:r>
+            <w:proofErr w:type="gramEnd"/>
+            <w:r>
+              <w:rPr>
+                <w:rFonts w:eastAsia="微軟正黑體"/>
+                <w:i/>
+                <w:color w:val="C00000"/>
+                <w:sz w:val="11"/>
+              </w:rPr>
+              <w:t xml:space="preserve"> 2026-08-25 / TPE</w:t>
             </w:r>
           </w:p>
         </w:tc>
@@ -2966,7 +4539,7 @@
 </file>
 
 <file path=word/numbering.xml><?xml version="1.0" encoding="utf-8"?>
-<w:numbering xmlns:wpc="http://schemas.microsoft.com/office/word/2010/wordprocessingCanvas" xmlns:cx="http://schemas.microsoft.com/office/drawing/2014/chartex" xmlns:cx1="http://schemas.microsoft.com/office/drawing/2015/9/8/chartex" xmlns:cx2="http://schemas.microsoft.com/office/drawing/2015/10/21/chartex" xmlns:cx3="http://schemas.microsoft.com/office/drawing/2016/5/9/chartex" xmlns:cx4="http://schemas.microsoft.com/office/drawing/2016/5/10/chartex" xmlns:cx5="http://schemas.microsoft.com/office/drawing/2016/5/11/chartex" xmlns:cx6="http://schemas.microsoft.com/office/drawing/2016/5/12/chartex" xmlns:cx7="http://schemas.microsoft.com/office/drawing/2016/5/13/chartex" xmlns:cx8="http://schemas.microsoft.com/office/drawing/2016/5/14/chartex" xmlns:mc="http://schemas.openxmlformats.org/markup-compatibility/2006" xmlns:aink="http://schemas.microsoft.com/office/drawing/2016/ink" xmlns:am3d="http://schemas.microsoft.com/office/drawing/2017/model3d" xmlns:o="urn:schemas-microsoft-com:office:office" xmlns:oel="http://schemas.microsoft.com/office/2019/extlst" xmlns:r="http://schemas.openxmlformats.org/officeDocument/2006/relationships" xmlns:m="http://schemas.openxmlformats.org/officeDocument/2006/math" xmlns:v="urn:schemas-microsoft-com:vml" xmlns:wp14="http://schemas.microsoft.com/office/word/2010/wordprocessingDrawing" xmlns:wp="http://schemas.openxmlformats.org/drawingml/2006/wordprocessingDrawing" xmlns:w10="urn:schemas-microsoft-com:office:word" xmlns:w="http://schemas.openxmlformats.org/wordprocessingml/2006/main" xmlns:w14="http://schemas.microsoft.com/office/word/2010/wordml" xmlns:w15="http://schemas.microsoft.com/office/word/2012/wordml" xmlns:w16cei="http://schemas.microsoft.com/office/word/2026/wordml/cei" xmlns:w16cex="http://schemas.microsoft.com/office/word/2018/wordml/cex" xmlns:w16cid="http://schemas.microsoft.com/office/word/2016/wordml/cid" xmlns:w16="http://schemas.microsoft.com/office/word/2018/wordml" xmlns:w16du="http://schemas.microsoft.com/office/word/2023/wordml/word16du" xmlns:w16sdtdh="http://schemas.microsoft.com/office/word/2020/wordml/sdtdatahash" xmlns:w16sdtfl="http://schemas.microsoft.com/office/word/2024/wordml/sdtformatlock" xmlns:w16se="http://schemas.microsoft.com/office/word/2015/wordml/symex" xmlns:wpg="http://schemas.microsoft.com/office/word/2010/wordprocessingGroup" xmlns:wpi="http://schemas.microsoft.com/office/word/2010/wordprocessingInk" xmlns:wne="http://schemas.microsoft.com/office/word/2006/wordml" xmlns:wps="http://schemas.microsoft.com/office/word/2010/wordprocessingShape" mc:Ignorable="w14 w15 w16se w16cid w16 w16cex w16sdtdh w16sdtfl w16du wp14">
+<w:numbering xmlns:wpc="http://schemas.microsoft.com/office/word/2010/wordprocessingCanvas" xmlns:cx="http://schemas.microsoft.com/office/drawing/2014/chartex" xmlns:cx1="http://schemas.microsoft.com/office/drawing/2015/9/8/chartex" xmlns:cx2="http://schemas.microsoft.com/office/drawing/2015/10/21/chartex" xmlns:cx3="http://schemas.microsoft.com/office/drawing/2016/5/9/chartex" xmlns:cx4="http://schemas.microsoft.com/office/drawing/2016/5/10/chartex" xmlns:cx5="http://schemas.microsoft.com/office/drawing/2016/5/11/chartex" xmlns:cx6="http://schemas.microsoft.com/office/drawing/2016/5/12/chartex" xmlns:cx7="http://schemas.microsoft.com/office/drawing/2016/5/13/chartex" xmlns:cx8="http://schemas.microsoft.com/office/drawing/2016/5/14/chartex" xmlns:mc="http://schemas.openxmlformats.org/markup-compatibility/2006" xmlns:aink="http://schemas.microsoft.com/office/drawing/2016/ink" xmlns:am3d="http://schemas.microsoft.com/office/drawing/2017/model3d" xmlns:o="urn:schemas-microsoft-com:office:office" xmlns:oel="http://schemas.microsoft.com/office/2019/extlst" xmlns:r="http://schemas.openxmlformats.org/officeDocument/2006/relationships" xmlns:m="http://schemas.openxmlformats.org/officeDocument/2006/math" xmlns:v="urn:schemas-microsoft-com:vml" xmlns:wp14="http://schemas.microsoft.com/office/word/2010/wordprocessingDrawing" xmlns:wp="http://schemas.openxmlformats.org/drawingml/2006/wordprocessingDrawing" xmlns:w10="urn:schemas-microsoft-com:office:word" xmlns:w="http://schemas.openxmlformats.org/wordprocessingml/2006/main" xmlns:w14="http://schemas.microsoft.com/office/word/2010/wordml" xmlns:w15="http://schemas.microsoft.com/office/word/2012/wordml" xmlns:w16cex="http://schemas.microsoft.com/office/word/2018/wordml/cex" xmlns:w16cid="http://schemas.microsoft.com/office/word/2016/wordml/cid" xmlns:w16="http://schemas.microsoft.com/office/word/2018/wordml" xmlns:w16du="http://schemas.microsoft.com/office/word/2023/wordml/word16du" xmlns:w16sdtdh="http://schemas.microsoft.com/office/word/2020/wordml/sdtdatahash" xmlns:w16sdtfl="http://schemas.microsoft.com/office/word/2024/wordml/sdtformatlock" xmlns:w16se="http://schemas.microsoft.com/office/word/2015/wordml/symex" xmlns:wpg="http://schemas.microsoft.com/office/word/2010/wordprocessingGroup" xmlns:wpi="http://schemas.microsoft.com/office/word/2010/wordprocessingInk" xmlns:wne="http://schemas.microsoft.com/office/word/2006/wordml" xmlns:wps="http://schemas.microsoft.com/office/word/2010/wordprocessingShape" mc:Ignorable="w14 w15 w16se w16cid w16 w16cex w16sdtdh w16sdtfl w16du wp14">
   <w:abstractNum w:abstractNumId="0" w15:restartNumberingAfterBreak="0">
     <w:nsid w:val="FFFFFF7C"/>
     <w:multiLevelType w:val="singleLevel"/>

</xml_diff>